<commit_message>
docs: fill 6-member team table; embed verified Wireshark screenshots as Screenshot 1-4 in section 5.3
</commit_message>
<xml_diff>
--- a/Case Study 5 - POP3 Mailbox Access in a Low-Bandwidth Branch.docx
+++ b/Case Study 5 - POP3 Mailbox Access in a Low-Bandwidth Branch.docx
@@ -2,7 +2,7 @@
 <file path=word/document.xml><?xml version="1.0" encoding="utf-8"?>
 <w:document xmlns:w="http://schemas.openxmlformats.org/wordprocessingml/2006/main" xmlns:m="http://schemas.openxmlformats.org/officeDocument/2006/math" xmlns:r="http://schemas.openxmlformats.org/officeDocument/2006/relationships" xmlns:o="urn:schemas-microsoft-com:office:office" xmlns:v="urn:schemas-microsoft-com:vml" xmlns:w10="urn:schemas-microsoft-com:office:word" xmlns:a="http://schemas.openxmlformats.org/drawingml/2006/main" xmlns:pic="http://schemas.openxmlformats.org/drawingml/2006/picture" xmlns:wp="http://schemas.openxmlformats.org/drawingml/2006/wordprocessingDrawing">
   <w:body>
-    <w:bookmarkStart w:id="60" w:name="computer-networks-bacse203"/>
+    <w:bookmarkStart w:id="72" w:name="computer-networks-bacse203"/>
     <w:p>
       <w:pPr>
         <w:pStyle w:val="Heading1"/>
@@ -331,31 +331,31 @@
               <w:jc w:val="left"/>
             </w:pPr>
             <w:r>
-              <w:t xml:space="preserve">25BCE0344</w:t>
-            </w:r>
-          </w:p>
-        </w:tc>
-        <w:tc>
-          <w:tcPr/>
-          <w:p>
-            <w:pPr>
-              <w:pStyle w:val="Compact"/>
-              <w:jc w:val="left"/>
-            </w:pPr>
-            <w:r>
-              <w:t xml:space="preserve">Arunya Srivastava</w:t>
-            </w:r>
-          </w:p>
-        </w:tc>
-        <w:tc>
-          <w:tcPr/>
-          <w:p>
-            <w:pPr>
-              <w:pStyle w:val="Compact"/>
-              <w:jc w:val="left"/>
-            </w:pPr>
-            <w:r>
-              <w:t xml:space="preserve">Lead protocol analyst and FSM architect</w:t>
+              <w:t xml:space="preserve">25BCE0337</w:t>
+            </w:r>
+          </w:p>
+        </w:tc>
+        <w:tc>
+          <w:tcPr/>
+          <w:p>
+            <w:pPr>
+              <w:pStyle w:val="Compact"/>
+              <w:jc w:val="left"/>
+            </w:pPr>
+            <w:r>
+              <w:t xml:space="preserve">Pratik Ambastha</w:t>
+            </w:r>
+          </w:p>
+        </w:tc>
+        <w:tc>
+          <w:tcPr/>
+          <w:p>
+            <w:pPr>
+              <w:pStyle w:val="Compact"/>
+              <w:jc w:val="left"/>
+            </w:pPr>
+            <w:r>
+              <w:t xml:space="preserve">Simulation and packet-analysis specialist</w:t>
             </w:r>
           </w:p>
         </w:tc>
@@ -369,31 +369,31 @@
               <w:jc w:val="left"/>
             </w:pPr>
             <w:r>
-              <w:t xml:space="preserve">—</w:t>
-            </w:r>
-          </w:p>
-        </w:tc>
-        <w:tc>
-          <w:tcPr/>
-          <w:p>
-            <w:pPr>
-              <w:pStyle w:val="Compact"/>
-              <w:jc w:val="left"/>
-            </w:pPr>
-            <w:r>
-              <w:t xml:space="preserve">—</w:t>
-            </w:r>
-          </w:p>
-        </w:tc>
-        <w:tc>
-          <w:tcPr/>
-          <w:p>
-            <w:pPr>
-              <w:pStyle w:val="Compact"/>
-              <w:jc w:val="left"/>
-            </w:pPr>
-            <w:r>
-              <w:t xml:space="preserve">WAN systems and workflow architect</w:t>
+              <w:t xml:space="preserve">25BCE0344</w:t>
+            </w:r>
+          </w:p>
+        </w:tc>
+        <w:tc>
+          <w:tcPr/>
+          <w:p>
+            <w:pPr>
+              <w:pStyle w:val="Compact"/>
+              <w:jc w:val="left"/>
+            </w:pPr>
+            <w:r>
+              <w:t xml:space="preserve">Arunya Srivastava</w:t>
+            </w:r>
+          </w:p>
+        </w:tc>
+        <w:tc>
+          <w:tcPr/>
+          <w:p>
+            <w:pPr>
+              <w:pStyle w:val="Compact"/>
+              <w:jc w:val="left"/>
+            </w:pPr>
+            <w:r>
+              <w:t xml:space="preserve">Lead protocol analyst and FSM architect</w:t>
             </w:r>
           </w:p>
         </w:tc>
@@ -407,31 +407,31 @@
               <w:jc w:val="left"/>
             </w:pPr>
             <w:r>
-              <w:t xml:space="preserve">—</w:t>
-            </w:r>
-          </w:p>
-        </w:tc>
-        <w:tc>
-          <w:tcPr/>
-          <w:p>
-            <w:pPr>
-              <w:pStyle w:val="Compact"/>
-              <w:jc w:val="left"/>
-            </w:pPr>
-            <w:r>
-              <w:t xml:space="preserve">—</w:t>
-            </w:r>
-          </w:p>
-        </w:tc>
-        <w:tc>
-          <w:tcPr/>
-          <w:p>
-            <w:pPr>
-              <w:pStyle w:val="Compact"/>
-              <w:jc w:val="left"/>
-            </w:pPr>
-            <w:r>
-              <w:t xml:space="preserve">Simulation and packet-analysis specialist</w:t>
+              <w:t xml:space="preserve">25BCE0401</w:t>
+            </w:r>
+          </w:p>
+        </w:tc>
+        <w:tc>
+          <w:tcPr/>
+          <w:p>
+            <w:pPr>
+              <w:pStyle w:val="Compact"/>
+              <w:jc w:val="left"/>
+            </w:pPr>
+            <w:r>
+              <w:t xml:space="preserve">Adarsh Kumar Singh</w:t>
+            </w:r>
+          </w:p>
+        </w:tc>
+        <w:tc>
+          <w:tcPr/>
+          <w:p>
+            <w:pPr>
+              <w:pStyle w:val="Compact"/>
+              <w:jc w:val="left"/>
+            </w:pPr>
+            <w:r>
+              <w:t xml:space="preserve">WAN systems and workflow architect</w:t>
             </w:r>
           </w:p>
         </w:tc>
@@ -445,19 +445,19 @@
               <w:jc w:val="left"/>
             </w:pPr>
             <w:r>
-              <w:t xml:space="preserve">—</w:t>
-            </w:r>
-          </w:p>
-        </w:tc>
-        <w:tc>
-          <w:tcPr/>
-          <w:p>
-            <w:pPr>
-              <w:pStyle w:val="Compact"/>
-              <w:jc w:val="left"/>
-            </w:pPr>
-            <w:r>
-              <w:t xml:space="preserve">—</w:t>
+              <w:t xml:space="preserve">25BCE0998</w:t>
+            </w:r>
+          </w:p>
+        </w:tc>
+        <w:tc>
+          <w:tcPr/>
+          <w:p>
+            <w:pPr>
+              <w:pStyle w:val="Compact"/>
+              <w:jc w:val="left"/>
+            </w:pPr>
+            <w:r>
+              <w:t xml:space="preserve">Pranjal Paul</w:t>
             </w:r>
           </w:p>
         </w:tc>
@@ -483,19 +483,19 @@
               <w:jc w:val="left"/>
             </w:pPr>
             <w:r>
-              <w:t xml:space="preserve">—</w:t>
-            </w:r>
-          </w:p>
-        </w:tc>
-        <w:tc>
-          <w:tcPr/>
-          <w:p>
-            <w:pPr>
-              <w:pStyle w:val="Compact"/>
-              <w:jc w:val="left"/>
-            </w:pPr>
-            <w:r>
-              <w:t xml:space="preserve">—</w:t>
+              <w:t xml:space="preserve">25BCE2004</w:t>
+            </w:r>
+          </w:p>
+        </w:tc>
+        <w:tc>
+          <w:tcPr/>
+          <w:p>
+            <w:pPr>
+              <w:pStyle w:val="Compact"/>
+              <w:jc w:val="left"/>
+            </w:pPr>
+            <w:r>
+              <w:t xml:space="preserve">Bhavya Singh</w:t>
             </w:r>
           </w:p>
         </w:tc>
@@ -508,6 +508,44 @@
             </w:pPr>
             <w:r>
               <w:t xml:space="preserve">Standards, benchmarks and quality lead</w:t>
+            </w:r>
+          </w:p>
+        </w:tc>
+      </w:tr>
+      <w:tr>
+        <w:tc>
+          <w:tcPr/>
+          <w:p>
+            <w:pPr>
+              <w:pStyle w:val="Compact"/>
+              <w:jc w:val="left"/>
+            </w:pPr>
+            <w:r>
+              <w:t xml:space="preserve">25BBS0046</w:t>
+            </w:r>
+          </w:p>
+        </w:tc>
+        <w:tc>
+          <w:tcPr/>
+          <w:p>
+            <w:pPr>
+              <w:pStyle w:val="Compact"/>
+              <w:jc w:val="left"/>
+            </w:pPr>
+            <w:r>
+              <w:t xml:space="preserve">Shriyansh Gangwar</w:t>
+            </w:r>
+          </w:p>
+        </w:tc>
+        <w:tc>
+          <w:tcPr/>
+          <w:p>
+            <w:pPr>
+              <w:pStyle w:val="Compact"/>
+              <w:jc w:val="left"/>
+            </w:pPr>
+            <w:r>
+              <w:t xml:space="preserve">Simulation and packet-analysis specialist</w:t>
             </w:r>
           </w:p>
         </w:tc>
@@ -4266,7 +4304,7 @@
     </w:p>
     <w:bookmarkEnd w:id="33"/>
     <w:bookmarkEnd w:id="34"/>
-    <w:bookmarkStart w:id="49" w:name="Xebc64180df78ab72118f9e4a706002811a21067"/>
+    <w:bookmarkStart w:id="61" w:name="Xebc64180df78ab72118f9e4a706002811a21067"/>
     <w:p>
       <w:pPr>
         <w:pStyle w:val="Heading2"/>
@@ -4885,7 +4923,7 @@
       </w:r>
     </w:p>
     <w:bookmarkEnd w:id="39"/>
-    <w:bookmarkStart w:id="43" w:name="results"/>
+    <w:bookmarkStart w:id="55" w:name="results"/>
     <w:p>
       <w:pPr>
         <w:pStyle w:val="Heading3"/>
@@ -6517,14 +6555,16 @@
         <w:t xml:space="preserve">The capture also retains TCP keepalive probes from the server toward the orphaned connection (frames 1207 and 1225), which is the mechanism that eventually reclaims the lock in a production deployment.</w:t>
       </w:r>
     </w:p>
-    <w:bookmarkEnd w:id="43"/>
-    <w:bookmarkStart w:id="47" w:name="design-of-the-resilient-workflow"/>
-    <w:p>
-      <w:pPr>
-        <w:pStyle w:val="Heading3"/>
-      </w:pPr>
-      <w:r>
-        <w:t xml:space="preserve">5.4 Design of the resilient workflow</w:t>
+    <w:p>
+      <w:pPr>
+        <w:pStyle w:val="BodyText"/>
+      </w:pPr>
+      <w:r>
+        <w:rPr>
+          <w:b/>
+          <w:bCs/>
+        </w:rPr>
+        <w:t xml:space="preserve">Wireshark evidence (v4.6.9, full-screen views of the shipped capture).</w:t>
       </w:r>
     </w:p>
     <w:p>
@@ -6534,20 +6574,480 @@
       <w:r>
         <w:drawing>
           <wp:inline>
-            <wp:extent cx="5727700" cy="3133100"/>
+            <wp:extent cx="5727700" cy="2956328"/>
             <wp:effectExtent b="0" l="0" r="0" t="0"/>
-            <wp:docPr descr="Five-tier workflow" title="" id="45" name="Picture"/>
+            <wp:docPr descr="POP dialogue" title="" id="44" name="Picture"/>
             <a:graphic>
               <a:graphicData uri="http://schemas.openxmlformats.org/drawingml/2006/picture">
                 <pic:pic>
                   <pic:nvPicPr>
-                    <pic:cNvPr descr="figures/fig3_workflow_architecture.png" id="46" name="Picture"/>
+                    <pic:cNvPr descr="screenshots/win01_pop_dialogue.png" id="45" name="Picture"/>
                     <pic:cNvPicPr>
                       <a:picLocks noChangeArrowheads="1" noChangeAspect="1"/>
                     </pic:cNvPicPr>
                   </pic:nvPicPr>
                   <pic:blipFill>
-                    <a:blip r:embed="rId44"/>
+                    <a:blip r:embed="rId43"/>
+                    <a:stretch>
+                      <a:fillRect/>
+                    </a:stretch>
+                  </pic:blipFill>
+                  <pic:spPr bwMode="auto">
+                    <a:xfrm>
+                      <a:off x="0" y="0"/>
+                      <a:ext cx="5727700" cy="2956328"/>
+                    </a:xfrm>
+                    <a:prstGeom prst="rect">
+                      <a:avLst/>
+                    </a:prstGeom>
+                    <a:noFill/>
+                    <a:ln w="9525">
+                      <a:noFill/>
+                      <a:headEnd/>
+                      <a:tailEnd/>
+                    </a:ln>
+                  </pic:spPr>
+                </pic:pic>
+              </a:graphicData>
+            </a:graphic>
+          </wp:inline>
+        </w:drawing>
+      </w:r>
+    </w:p>
+    <w:p>
+      <w:pPr>
+        <w:pStyle w:val="ImageCaption"/>
+      </w:pPr>
+      <w:r>
+        <w:t xml:space="preserve">POP dialogue</w:t>
+      </w:r>
+    </w:p>
+    <w:p>
+      <w:pPr>
+        <w:pStyle w:val="BodyText"/>
+      </w:pPr>
+      <w:r>
+        <w:rPr>
+          <w:i/>
+          <w:iCs/>
+        </w:rPr>
+        <w:t xml:space="preserve">Screenshot 1 — Display filter</w:t>
+      </w:r>
+      <w:r>
+        <w:rPr>
+          <w:i/>
+          <w:iCs/>
+        </w:rPr>
+        <w:t xml:space="preserve"> </w:t>
+      </w:r>
+      <w:r>
+        <w:rPr>
+          <w:rStyle w:val="VerbatimChar"/>
+          <w:i/>
+          <w:iCs/>
+        </w:rPr>
+        <w:t xml:space="preserve">pop</w:t>
+      </w:r>
+      <w:r>
+        <w:rPr>
+          <w:i/>
+          <w:iCs/>
+        </w:rPr>
+        <w:t xml:space="preserve"> </w:t>
+      </w:r>
+      <w:r>
+        <w:rPr>
+          <w:i/>
+          <w:iCs/>
+        </w:rPr>
+        <w:t xml:space="preserve">(556 frames shown, count verified against</w:t>
+      </w:r>
+      <w:r>
+        <w:rPr>
+          <w:i/>
+          <w:iCs/>
+        </w:rPr>
+        <w:t xml:space="preserve"> </w:t>
+      </w:r>
+      <w:r>
+        <w:rPr>
+          <w:rStyle w:val="VerbatimChar"/>
+          <w:i/>
+          <w:iCs/>
+        </w:rPr>
+        <w:t xml:space="preserve">tshark</w:t>
+      </w:r>
+      <w:r>
+        <w:rPr>
+          <w:i/>
+          <w:iCs/>
+        </w:rPr>
+        <w:t xml:space="preserve">): the complete USER/PASS/STAT/LIST/UIDL/TOP/RETR dialogue decoded on TCP port 1110.</w:t>
+      </w:r>
+    </w:p>
+    <w:p>
+      <w:pPr>
+        <w:pStyle w:val="CaptionedFigure"/>
+      </w:pPr>
+      <w:r>
+        <w:drawing>
+          <wp:inline>
+            <wp:extent cx="5727700" cy="2956328"/>
+            <wp:effectExtent b="0" l="0" r="0" t="0"/>
+            <wp:docPr descr="SYN handshakes" title="" id="47" name="Picture"/>
+            <a:graphic>
+              <a:graphicData uri="http://schemas.openxmlformats.org/drawingml/2006/picture">
+                <pic:pic>
+                  <pic:nvPicPr>
+                    <pic:cNvPr descr="screenshots/win02_syn_handshake.png" id="48" name="Picture"/>
+                    <pic:cNvPicPr>
+                      <a:picLocks noChangeArrowheads="1" noChangeAspect="1"/>
+                    </pic:cNvPicPr>
+                  </pic:nvPicPr>
+                  <pic:blipFill>
+                    <a:blip r:embed="rId46"/>
+                    <a:stretch>
+                      <a:fillRect/>
+                    </a:stretch>
+                  </pic:blipFill>
+                  <pic:spPr bwMode="auto">
+                    <a:xfrm>
+                      <a:off x="0" y="0"/>
+                      <a:ext cx="5727700" cy="2956328"/>
+                    </a:xfrm>
+                    <a:prstGeom prst="rect">
+                      <a:avLst/>
+                    </a:prstGeom>
+                    <a:noFill/>
+                    <a:ln w="9525">
+                      <a:noFill/>
+                      <a:headEnd/>
+                      <a:tailEnd/>
+                    </a:ln>
+                  </pic:spPr>
+                </pic:pic>
+              </a:graphicData>
+            </a:graphic>
+          </wp:inline>
+        </w:drawing>
+      </w:r>
+    </w:p>
+    <w:p>
+      <w:pPr>
+        <w:pStyle w:val="ImageCaption"/>
+      </w:pPr>
+      <w:r>
+        <w:t xml:space="preserve">SYN handshakes</w:t>
+      </w:r>
+    </w:p>
+    <w:p>
+      <w:pPr>
+        <w:pStyle w:val="BodyText"/>
+      </w:pPr>
+      <w:r>
+        <w:rPr>
+          <w:i/>
+          <w:iCs/>
+        </w:rPr>
+        <w:t xml:space="preserve">Screenshot 2 —</w:t>
+      </w:r>
+      <w:r>
+        <w:rPr>
+          <w:i/>
+          <w:iCs/>
+        </w:rPr>
+        <w:t xml:space="preserve"> </w:t>
+      </w:r>
+      <w:r>
+        <w:rPr>
+          <w:rStyle w:val="VerbatimChar"/>
+          <w:i/>
+          <w:iCs/>
+        </w:rPr>
+        <w:t xml:space="preserve">tcp.flags.syn == 1 &amp;&amp; tcp.port == 1110</w:t>
+      </w:r>
+      <w:r>
+        <w:rPr>
+          <w:i/>
+          <w:iCs/>
+        </w:rPr>
+        <w:t xml:space="preserve">: the handshakes of both client sessions.</w:t>
+      </w:r>
+    </w:p>
+    <w:p>
+      <w:pPr>
+        <w:pStyle w:val="CaptionedFigure"/>
+      </w:pPr>
+      <w:r>
+        <w:drawing>
+          <wp:inline>
+            <wp:extent cx="5727700" cy="2956328"/>
+            <wp:effectExtent b="0" l="0" r="0" t="0"/>
+            <wp:docPr descr="Follow TCP Stream, session 1" title="" id="50" name="Picture"/>
+            <a:graphic>
+              <a:graphicData uri="http://schemas.openxmlformats.org/drawingml/2006/picture">
+                <pic:pic>
+                  <pic:nvPicPr>
+                    <pic:cNvPr descr="screenshots/win03_follow_stream_session1_retr_blackout.png" id="51" name="Picture"/>
+                    <pic:cNvPicPr>
+                      <a:picLocks noChangeArrowheads="1" noChangeAspect="1"/>
+                    </pic:cNvPicPr>
+                  </pic:nvPicPr>
+                  <pic:blipFill>
+                    <a:blip r:embed="rId49"/>
+                    <a:stretch>
+                      <a:fillRect/>
+                    </a:stretch>
+                  </pic:blipFill>
+                  <pic:spPr bwMode="auto">
+                    <a:xfrm>
+                      <a:off x="0" y="0"/>
+                      <a:ext cx="5727700" cy="2956328"/>
+                    </a:xfrm>
+                    <a:prstGeom prst="rect">
+                      <a:avLst/>
+                    </a:prstGeom>
+                    <a:noFill/>
+                    <a:ln w="9525">
+                      <a:noFill/>
+                      <a:headEnd/>
+                      <a:tailEnd/>
+                    </a:ln>
+                  </pic:spPr>
+                </pic:pic>
+              </a:graphicData>
+            </a:graphic>
+          </wp:inline>
+        </w:drawing>
+      </w:r>
+    </w:p>
+    <w:p>
+      <w:pPr>
+        <w:pStyle w:val="ImageCaption"/>
+      </w:pPr>
+      <w:r>
+        <w:t xml:space="preserve">Follow TCP Stream, session 1</w:t>
+      </w:r>
+    </w:p>
+    <w:p>
+      <w:pPr>
+        <w:pStyle w:val="BodyText"/>
+      </w:pPr>
+      <w:r>
+        <w:rPr>
+          <w:i/>
+          <w:iCs/>
+        </w:rPr>
+        <w:t xml:space="preserve">Screenshot 3 — Follow TCP Stream, first session: login,</w:t>
+      </w:r>
+      <w:r>
+        <w:rPr>
+          <w:i/>
+          <w:iCs/>
+        </w:rPr>
+        <w:t xml:space="preserve"> </w:t>
+      </w:r>
+      <w:r>
+        <w:rPr>
+          <w:rStyle w:val="VerbatimChar"/>
+          <w:i/>
+          <w:iCs/>
+        </w:rPr>
+        <w:t xml:space="preserve">TOP 4 0</w:t>
+      </w:r>
+      <w:r>
+        <w:rPr>
+          <w:i/>
+          <w:iCs/>
+        </w:rPr>
+        <w:t xml:space="preserve">, then</w:t>
+      </w:r>
+      <w:r>
+        <w:rPr>
+          <w:i/>
+          <w:iCs/>
+        </w:rPr>
+        <w:t xml:space="preserve"> </w:t>
+      </w:r>
+      <w:r>
+        <w:rPr>
+          <w:rStyle w:val="VerbatimChar"/>
+          <w:i/>
+          <w:iCs/>
+        </w:rPr>
+        <w:t xml:space="preserve">RETR 4</w:t>
+      </w:r>
+      <w:r>
+        <w:rPr>
+          <w:i/>
+          <w:iCs/>
+        </w:rPr>
+        <w:t xml:space="preserve"> </w:t>
+      </w:r>
+      <w:r>
+        <w:rPr>
+          <w:i/>
+          <w:iCs/>
+        </w:rPr>
+        <w:t xml:space="preserve">truncated at 41.4 % by the link blackout.</w:t>
+      </w:r>
+    </w:p>
+    <w:p>
+      <w:pPr>
+        <w:pStyle w:val="CaptionedFigure"/>
+      </w:pPr>
+      <w:r>
+        <w:drawing>
+          <wp:inline>
+            <wp:extent cx="5727700" cy="2956328"/>
+            <wp:effectExtent b="0" l="0" r="0" t="0"/>
+            <wp:docPr descr="Follow TCP Stream, session 2" title="" id="53" name="Picture"/>
+            <a:graphic>
+              <a:graphicData uri="http://schemas.openxmlformats.org/drawingml/2006/picture">
+                <pic:pic>
+                  <pic:nvPicPr>
+                    <pic:cNvPr descr="screenshots/win04_follow_stream_session2_lockout.png" id="54" name="Picture"/>
+                    <pic:cNvPicPr>
+                      <a:picLocks noChangeArrowheads="1" noChangeAspect="1"/>
+                    </pic:cNvPicPr>
+                  </pic:nvPicPr>
+                  <pic:blipFill>
+                    <a:blip r:embed="rId52"/>
+                    <a:stretch>
+                      <a:fillRect/>
+                    </a:stretch>
+                  </pic:blipFill>
+                  <pic:spPr bwMode="auto">
+                    <a:xfrm>
+                      <a:off x="0" y="0"/>
+                      <a:ext cx="5727700" cy="2956328"/>
+                    </a:xfrm>
+                    <a:prstGeom prst="rect">
+                      <a:avLst/>
+                    </a:prstGeom>
+                    <a:noFill/>
+                    <a:ln w="9525">
+                      <a:noFill/>
+                      <a:headEnd/>
+                      <a:tailEnd/>
+                    </a:ln>
+                  </pic:spPr>
+                </pic:pic>
+              </a:graphicData>
+            </a:graphic>
+          </wp:inline>
+        </w:drawing>
+      </w:r>
+    </w:p>
+    <w:p>
+      <w:pPr>
+        <w:pStyle w:val="ImageCaption"/>
+      </w:pPr>
+      <w:r>
+        <w:t xml:space="preserve">Follow TCP Stream, session 2</w:t>
+      </w:r>
+    </w:p>
+    <w:p>
+      <w:pPr>
+        <w:pStyle w:val="BodyText"/>
+      </w:pPr>
+      <w:r>
+        <w:rPr>
+          <w:i/>
+          <w:iCs/>
+        </w:rPr>
+        <w:t xml:space="preserve">Screenshot 4 — Follow TCP Stream, reconnect:</w:t>
+      </w:r>
+      <w:r>
+        <w:rPr>
+          <w:i/>
+          <w:iCs/>
+        </w:rPr>
+        <w:t xml:space="preserve"> </w:t>
+      </w:r>
+      <w:r>
+        <w:rPr>
+          <w:rStyle w:val="VerbatimChar"/>
+          <w:i/>
+          <w:iCs/>
+        </w:rPr>
+        <w:t xml:space="preserve">PASS</w:t>
+      </w:r>
+      <w:r>
+        <w:rPr>
+          <w:i/>
+          <w:iCs/>
+        </w:rPr>
+        <w:t xml:space="preserve"> </w:t>
+      </w:r>
+      <w:r>
+        <w:rPr>
+          <w:i/>
+          <w:iCs/>
+        </w:rPr>
+        <w:t xml:space="preserve">answered 451 ms later with</w:t>
+      </w:r>
+      <w:r>
+        <w:rPr>
+          <w:i/>
+          <w:iCs/>
+        </w:rPr>
+        <w:t xml:space="preserve"> </w:t>
+      </w:r>
+      <w:r>
+        <w:rPr>
+          <w:rStyle w:val="VerbatimChar"/>
+          <w:i/>
+          <w:iCs/>
+        </w:rPr>
+        <w:t xml:space="preserve">-ERR [IN-USE]</w:t>
+      </w:r>
+      <w:r>
+        <w:rPr>
+          <w:i/>
+          <w:iCs/>
+        </w:rPr>
+        <w:t xml:space="preserve"> </w:t>
+      </w:r>
+      <w:r>
+        <w:rPr>
+          <w:i/>
+          <w:iCs/>
+        </w:rPr>
+        <w:t xml:space="preserve">— the orphaned session still holds the exclusive mailbox lock.</w:t>
+      </w:r>
+    </w:p>
+    <w:bookmarkEnd w:id="55"/>
+    <w:bookmarkStart w:id="59" w:name="design-of-the-resilient-workflow"/>
+    <w:p>
+      <w:pPr>
+        <w:pStyle w:val="Heading3"/>
+      </w:pPr>
+      <w:r>
+        <w:t xml:space="preserve">5.4 Design of the resilient workflow</w:t>
+      </w:r>
+    </w:p>
+    <w:p>
+      <w:pPr>
+        <w:pStyle w:val="CaptionedFigure"/>
+      </w:pPr>
+      <w:r>
+        <w:drawing>
+          <wp:inline>
+            <wp:extent cx="5727700" cy="3133100"/>
+            <wp:effectExtent b="0" l="0" r="0" t="0"/>
+            <wp:docPr descr="Five-tier workflow" title="" id="57" name="Picture"/>
+            <a:graphic>
+              <a:graphicData uri="http://schemas.openxmlformats.org/drawingml/2006/picture">
+                <pic:pic>
+                  <pic:nvPicPr>
+                    <pic:cNvPr descr="figures/fig3_workflow_architecture.png" id="58" name="Picture"/>
+                    <pic:cNvPicPr>
+                      <a:picLocks noChangeArrowheads="1" noChangeAspect="1"/>
+                    </pic:cNvPicPr>
+                  </pic:nvPicPr>
+                  <pic:blipFill>
+                    <a:blip r:embed="rId56"/>
                     <a:stretch>
                       <a:fillRect/>
                     </a:stretch>
@@ -6864,8 +7364,8 @@
         <w:t xml:space="preserve">, plus the byte offset of any partially fetched body. Because UIDLs are stable, a reconnect can tell “new” from “already seen” without re-downloading, which is the piece POP3 itself lacks.</w:t>
       </w:r>
     </w:p>
-    <w:bookmarkEnd w:id="47"/>
-    <w:bookmarkStart w:id="48" w:name="comparative-analysis"/>
+    <w:bookmarkEnd w:id="59"/>
+    <w:bookmarkStart w:id="60" w:name="comparative-analysis"/>
     <w:p>
       <w:pPr>
         <w:pStyle w:val="Heading3"/>
@@ -7363,9 +7863,9 @@
         </w:pict>
       </w:r>
     </w:p>
-    <w:bookmarkEnd w:id="48"/>
-    <w:bookmarkEnd w:id="49"/>
-    <w:bookmarkStart w:id="56" w:name="X1c1b84ae12c2b3fe89d3cbb884ac73f267debda"/>
+    <w:bookmarkEnd w:id="60"/>
+    <w:bookmarkEnd w:id="61"/>
+    <w:bookmarkStart w:id="68" w:name="X1c1b84ae12c2b3fe89d3cbb884ac73f267debda"/>
     <w:p>
       <w:pPr>
         <w:pStyle w:val="Heading2"/>
@@ -7374,7 +7874,7 @@
         <w:t xml:space="preserve">6. Answers to the assigned case-study questions</w:t>
       </w:r>
     </w:p>
-    <w:bookmarkStart w:id="53" w:name="Xd72ef45d3f79529031614ba6f810748527d2fd4"/>
+    <w:bookmarkStart w:id="65" w:name="Xd72ef45d3f79529031614ba6f810748527d2fd4"/>
     <w:p>
       <w:pPr>
         <w:pStyle w:val="Heading3"/>
@@ -7464,18 +7964,18 @@
           <wp:inline>
             <wp:extent cx="5727700" cy="2879426"/>
             <wp:effectExtent b="0" l="0" r="0" t="0"/>
-            <wp:docPr descr="POP3 state machine" title="" id="51" name="Picture"/>
+            <wp:docPr descr="POP3 state machine" title="" id="63" name="Picture"/>
             <a:graphic>
               <a:graphicData uri="http://schemas.openxmlformats.org/drawingml/2006/picture">
                 <pic:pic>
                   <pic:nvPicPr>
-                    <pic:cNvPr descr="figures/fig1_pop3_state_machine.png" id="52" name="Picture"/>
+                    <pic:cNvPr descr="figures/fig1_pop3_state_machine.png" id="64" name="Picture"/>
                     <pic:cNvPicPr>
                       <a:picLocks noChangeArrowheads="1" noChangeAspect="1"/>
                     </pic:cNvPicPr>
                   </pic:nvPicPr>
                   <pic:blipFill>
-                    <a:blip r:embed="rId50"/>
+                    <a:blip r:embed="rId62"/>
                     <a:stretch>
                       <a:fillRect/>
                     </a:stretch>
@@ -8052,8 +8552,8 @@
         <w:t xml:space="preserve">Port 110 exposes credentials and content. APOP replaces the password with an MD5 digest but is itself obsolete (§4.5).</w:t>
       </w:r>
     </w:p>
-    <w:bookmarkEnd w:id="53"/>
-    <w:bookmarkStart w:id="54" w:name="X7cb92ae6708614a96f0fbf0e8dd3cf8f7795acc"/>
+    <w:bookmarkEnd w:id="65"/>
+    <w:bookmarkStart w:id="66" w:name="X7cb92ae6708614a96f0fbf0e8dd3cf8f7795acc"/>
     <w:p>
       <w:pPr>
         <w:pStyle w:val="Heading3"/>
@@ -8504,8 +9004,8 @@
         <w:t xml:space="preserve">IMAP fixes flag synchronisation and selective fetch, but a stock IMAP client on a 450 ms link is still interactive: opening a folder, searching or previewing a message each costs round trips, and many clients pre-fetch bodies. IMAP is the right long-term protocol, and the proposed architecture uses it on the LAN. It is not a substitute for a local cache on this link.</w:t>
       </w:r>
     </w:p>
-    <w:bookmarkEnd w:id="54"/>
-    <w:bookmarkStart w:id="55" w:name="X7e360e9bf92c9955f0535735012cf746c4b6554"/>
+    <w:bookmarkEnd w:id="66"/>
+    <w:bookmarkStart w:id="67" w:name="X7e360e9bf92c9955f0535735012cf746c4b6554"/>
     <w:p>
       <w:pPr>
         <w:pStyle w:val="Heading3"/>
@@ -9029,9 +9529,9 @@
         </w:pict>
       </w:r>
     </w:p>
-    <w:bookmarkEnd w:id="55"/>
-    <w:bookmarkEnd w:id="56"/>
-    <w:bookmarkStart w:id="57" w:name="conclusion"/>
+    <w:bookmarkEnd w:id="67"/>
+    <w:bookmarkEnd w:id="68"/>
+    <w:bookmarkStart w:id="69" w:name="conclusion"/>
     <w:p>
       <w:pPr>
         <w:pStyle w:val="Heading2"/>
@@ -9237,8 +9737,8 @@
         </w:pict>
       </w:r>
     </w:p>
-    <w:bookmarkEnd w:id="57"/>
-    <w:bookmarkStart w:id="58" w:name="references"/>
+    <w:bookmarkEnd w:id="69"/>
+    <w:bookmarkStart w:id="70" w:name="references"/>
     <w:p>
       <w:pPr>
         <w:pStyle w:val="Heading2"/>
@@ -9461,8 +9961,8 @@
         </w:pict>
       </w:r>
     </w:p>
-    <w:bookmarkEnd w:id="58"/>
-    <w:bookmarkStart w:id="59" w:name="appendix-a-reproducing-the-experiment"/>
+    <w:bookmarkEnd w:id="70"/>
+    <w:bookmarkStart w:id="71" w:name="appendix-a-reproducing-the-experiment"/>
     <w:p>
       <w:pPr>
         <w:pStyle w:val="Heading2"/>
@@ -9850,8 +10350,8 @@
         <w:t xml:space="preserve">The emulator shapes application turns and data rate on loopback; it does not reproduce radio-layer propagation at the TCP handshake, and the 5 % loss is represented by the blackout event rather than by random per-packet drops. The lockout in the experiment is held for the duration of the run rather than for a production keepalive interval. These simplifications affect the absolute timings but not the protocol behaviour being demonstrated, and they are stated so that the evidence can be judged for what it is.</w:t>
       </w:r>
     </w:p>
-    <w:bookmarkEnd w:id="59"/>
-    <w:bookmarkEnd w:id="60"/>
+    <w:bookmarkEnd w:id="71"/>
+    <w:bookmarkEnd w:id="72"/>
     <w:sectPr>
       <w:pgSz w:h="16838" w:w="11906"/>
       <w:pgMar w:bottom="1440" w:footer="708" w:gutter="0" w:header="708" w:left="1440" w:right="1440" w:top="1440"/>

</xml_diff>

<commit_message>
docs: plain role wording in team tables; README team split updated to six members
</commit_message>
<xml_diff>
--- a/Case Study 5 - POP3 Mailbox Access in a Low-Bandwidth Branch.docx
+++ b/Case Study 5 - POP3 Mailbox Access in a Low-Bandwidth Branch.docx
@@ -355,7 +355,7 @@
               <w:jc w:val="left"/>
             </w:pPr>
             <w:r>
-              <w:t xml:space="preserve">Simulation and packet-analysis specialist</w:t>
+              <w:t xml:space="preserve">Simulation and packet analysis</w:t>
             </w:r>
           </w:p>
         </w:tc>
@@ -393,7 +393,7 @@
               <w:jc w:val="left"/>
             </w:pPr>
             <w:r>
-              <w:t xml:space="preserve">Lead protocol analyst and FSM architect</w:t>
+              <w:t xml:space="preserve">Protocol theory and report preparation</w:t>
             </w:r>
           </w:p>
         </w:tc>
@@ -431,7 +431,7 @@
               <w:jc w:val="left"/>
             </w:pPr>
             <w:r>
-              <w:t xml:space="preserve">WAN systems and workflow architect</w:t>
+              <w:t xml:space="preserve">Workflow design</w:t>
             </w:r>
           </w:p>
         </w:tc>
@@ -469,7 +469,7 @@
               <w:jc w:val="left"/>
             </w:pPr>
             <w:r>
-              <w:t xml:space="preserve">Cybersecurity and threat analyst</w:t>
+              <w:t xml:space="preserve">Security analysis</w:t>
             </w:r>
           </w:p>
         </w:tc>
@@ -507,7 +507,7 @@
               <w:jc w:val="left"/>
             </w:pPr>
             <w:r>
-              <w:t xml:space="preserve">Standards, benchmarks and quality lead</w:t>
+              <w:t xml:space="preserve">Standards and references</w:t>
             </w:r>
           </w:p>
         </w:tc>
@@ -545,7 +545,7 @@
               <w:jc w:val="left"/>
             </w:pPr>
             <w:r>
-              <w:t xml:space="preserve">Simulation and packet-analysis specialist</w:t>
+              <w:t xml:space="preserve">Testing and documentation</w:t>
             </w:r>
           </w:p>
         </w:tc>

</xml_diff>